<commit_message>
Cahier des charges: section admin + nom My Home CI
- Ajout section 10bis: 7 maquettes dashboard admin (format ecran desktop)
- Nom app corrige partout: My Home CI (M, H, C majuscules)

Co-Authored-By: Claude Opus 4.6 <noreply@anthropic.com>
</commit_message>
<xml_diff>
--- a/CAHIER_DES_CHARGES_MY_HOME_CI.docx
+++ b/CAHIER_DES_CHARGES_MY_HOME_CI.docx
@@ -127,7 +127,7 @@
           <w:sz w:val="52"/>
           <w:szCs w:val="52"/>
         </w:rPr>
-        <w:t xml:space="preserve">MY HOME CI</w:t>
+        <w:t xml:space="preserve">My Home CI</w:t>
       </w:r>
     </w:p>
     <w:p>
@@ -865,7 +865,7 @@
                 <w:sz w:val="21"/>
                 <w:szCs w:val="21"/>
               </w:rPr>
-              <w:t xml:space="preserve">MY HOME CI est une application mobile dediee au marche locatif ivoirien. Elle connecte directement les proprietaires de logements avec les personnes cherchant a louer, en eliminant les intermediaires et en offrant une experience moderne, geolocalisee et securisee.</w:t>
+              <w:t xml:space="preserve">My Home CI est une application mobile dediee au marche locatif ivoirien. Elle connecte directement les proprietaires de logements avec les personnes cherchant a louer, en eliminant les intermediaires et en offrant une experience moderne, geolocalisee et securisee.</w:t>
             </w:r>
           </w:p>
         </w:tc>
@@ -906,7 +906,7 @@
           <w:sz w:val="22"/>
           <w:szCs w:val="22"/>
         </w:rPr>
-        <w:t xml:space="preserve">Le marche immobilier en Cote d'Ivoire souffre d'un manque criant de digitalisation dans le segment locatif. Les chercheurs de logements dependent encore largement du bouche-a-oreille, des pancartes "A Louer" et des agences physiques qui prelevent des frais importants. Les proprietaires, de leur cote, peinent a trouver des locataires fiables sans passer par ces intermediaires couteux. MY HOME CI vise a combler ce vide en proposant une plateforme numerique gratuite, intuitive et centree sur la mise en relation directe.</w:t>
+        <w:t xml:space="preserve">Le marche immobilier en Cote d'Ivoire souffre d'un manque criant de digitalisation dans le segment locatif. Les chercheurs de logements dependent encore largement du bouche-a-oreille, des pancartes "A Louer" et des agences physiques qui prelevent des frais importants. Les proprietaires, de leur cote, peinent a trouver des locataires fiables sans passer par ces intermediaires couteux. My Home CI vise a combler ce vide en proposant une plateforme numerique gratuite, intuitive et centree sur la mise en relation directe.</w:t>
       </w:r>
     </w:p>
     <w:p>
@@ -1083,7 +1083,7 @@
                 <w:sz w:val="21"/>
                 <w:szCs w:val="21"/>
               </w:rPr>
-              <w:t xml:space="preserve">Important : MY HOME CI ne gere aucun paiement ni transaction financiere. La plateforme se concentre exclusivement sur la mise en relation.</w:t>
+              <w:t xml:space="preserve">Important : My Home CI ne gere aucun paiement ni transaction financiere. La plateforme se concentre exclusivement sur la mise en relation.</w:t>
             </w:r>
           </w:p>
         </w:tc>
@@ -1605,7 +1605,7 @@
                 <w:sz w:val="20"/>
                 <w:szCs w:val="20"/>
               </w:rPr>
-              <w:t xml:space="preserve">Equipe interne MY HOME CI</w:t>
+              <w:t xml:space="preserve">Equipe interne My Home CI</w:t>
             </w:r>
           </w:p>
         </w:tc>
@@ -2006,7 +2006,7 @@
           <w:sz w:val="22"/>
           <w:szCs w:val="22"/>
         </w:rPr>
-        <w:t xml:space="preserve">MY HOME CI repose sur un modele economique freemium combine a la publicite in-app. Aucune commission sur transaction n'est prelevee (pas de paiement integre).</w:t>
+        <w:t xml:space="preserve">My Home CI repose sur un modele economique freemium combine a la publicite in-app. Aucune commission sur transaction n'est prelevee (pas de paiement integre).</w:t>
       </w:r>
     </w:p>
     <w:p>
@@ -4247,7 +4247,7 @@
                 <w:sz w:val="20"/>
                 <w:szCs w:val="20"/>
               </w:rPr>
-              <w:t xml:space="preserve">Faiblesses face a MY HOME CI</w:t>
+              <w:t xml:space="preserve">Faiblesses face a My Home CI</w:t>
             </w:r>
           </w:p>
         </w:tc>
@@ -4621,7 +4621,7 @@
                 <w:sz w:val="20"/>
                 <w:szCs w:val="20"/>
               </w:rPr>
-              <w:t xml:space="preserve">MY HOME CI</w:t>
+              <w:t xml:space="preserve">My Home CI</w:t>
             </w:r>
           </w:p>
         </w:tc>
@@ -7522,7 +7522,7 @@
           <w:sz w:val="22"/>
           <w:szCs w:val="22"/>
         </w:rPr>
-        <w:t xml:space="preserve">Logo anime MY HOME CI avec slogan "Trouvez votre chez-vous"</w:t>
+        <w:t xml:space="preserve">Logo anime My Home CI avec slogan "Trouvez votre chez-vous"</w:t>
       </w:r>
     </w:p>
     <w:p>
@@ -14651,7 +14651,7 @@
           <w:sz w:val="22"/>
           <w:szCs w:val="22"/>
         </w:rPr>
-        <w:t xml:space="preserve">MY HOME CI est une plateforme de mise en relation locative mobile-first dediee au marche ivoirien. Elle connecte proprietaires et chercheurs de logements dans un ecosysteme simple, transparent et gratuit, sans intermediaires ni frais de commission.</w:t>
+        <w:t xml:space="preserve">My Home CI est une plateforme de mise en relation locative mobile-first dediee au marche ivoirien. Elle connecte proprietaires et chercheurs de logements dans un ecosysteme simple, transparent et gratuit, sans intermediaires ni frais de commission.</w:t>
       </w:r>
     </w:p>
     <w:p>
@@ -16406,7 +16406,7 @@
                 <w:sz w:val="20"/>
                 <w:szCs w:val="20"/>
               </w:rPr>
-              <w:t xml:space="preserve">Premier contact de l'utilisateur avec l'application. L'ecran Splash affiche le logo et le slogan MY HOME CI pendant le chargement. L'Onboarding (3 pages) presente les fonctionnalites cles : recherche geolocalisee, contact direct proprietaire, et sauvegarde de favoris. Il guide l'utilisateur vers l'inscription ou le mode invite.</w:t>
+              <w:t xml:space="preserve">Premier contact de l'utilisateur avec l'application. L'ecran Splash affiche le logo et le slogan My Home CI pendant le chargement. L'Onboarding (3 pages) presente les fonctionnalites cles : recherche geolocalisee, contact direct proprietaire, et sauvegarde de favoris. Il guide l'utilisateur vers l'inscription ou le mode invite.</w:t>
             </w:r>
           </w:p>
         </w:tc>
@@ -19206,6 +19206,1627 @@
           <w:sz w:val="36"/>
           <w:szCs w:val="36"/>
         </w:rPr>
+        <w:t xml:space="preserve">10bis. Dashboard Administrateur — Captures d'ecran (Web)</w:t>
+      </w:r>
+    </w:p>
+    <w:p>
+      <w:pPr>
+        <w:pBdr>
+          <w:bottom w:val="single" w:color="F5A623" w:sz="6"/>
+        </w:pBdr>
+        <w:spacing w:after="200" w:before="200"/>
+      </w:pPr>
+    </w:p>
+    <w:tbl>
+      <w:tblPr>
+        <w:tblW w:type="dxa" w:w="9000"/>
+        <w:tblBorders>
+          <w:top w:val="single" w:color="auto" w:sz="4"/>
+          <w:left w:val="single" w:color="auto" w:sz="4"/>
+          <w:bottom w:val="single" w:color="auto" w:sz="4"/>
+          <w:right w:val="single" w:color="auto" w:sz="4"/>
+          <w:insideH w:val="single" w:color="auto" w:sz="4"/>
+          <w:insideV w:val="single" w:color="auto" w:sz="4"/>
+        </w:tblBorders>
+      </w:tblPr>
+      <w:tblGrid>
+        <w:gridCol w:w="100"/>
+      </w:tblGrid>
+      <w:tr>
+        <w:tc>
+          <w:tcPr>
+            <w:tcW w:type="dxa" w:w="9000"/>
+            <w:tcBorders>
+              <w:top w:val="single" w:color="2E7D5B" w:sz="1"/>
+              <w:left w:val="single" w:color="2E7D5B" w:sz="8"/>
+              <w:bottom w:val="single" w:color="2E7D5B" w:sz="1"/>
+              <w:right w:val="single" w:color="2E7D5B" w:sz="1"/>
+            </w:tcBorders>
+            <w:shd w:fill="F0F4F2" w:val="clear"/>
+          </w:tcPr>
+          <w:p>
+            <w:pPr>
+              <w:spacing w:after="100" w:before="100"/>
+              <w:ind w:left="100" w:right="100"/>
+            </w:pPr>
+            <w:r>
+              <w:rPr>
+                <w:rFonts w:ascii="Calibri" w:cs="Calibri" w:eastAsia="Calibri" w:hAnsi="Calibri"/>
+                <w:i/>
+                <w:iCs/>
+                <w:color w:val="1A1A2E"/>
+                <w:sz w:val="21"/>
+                <w:szCs w:val="21"/>
+              </w:rPr>
+              <w:t xml:space="preserve">Cette section presente les maquettes du panneau d'administration web (My Home CI Admin), developpe en Next.js. Ce dashboard permet la gestion complete de la plateforme : utilisateurs, annonces, conversations, signalements et parametres. Les captures seront realisees depuis un navigateur desktop.</w:t>
+            </w:r>
+          </w:p>
+        </w:tc>
+      </w:tr>
+    </w:tbl>
+    <w:p>
+      <w:pPr>
+        <w:spacing w:after="100" w:before="100"/>
+      </w:pPr>
+    </w:p>
+    <w:p>
+      <w:pPr>
+        <w:pStyle w:val="Heading2"/>
+      </w:pPr>
+      <w:r>
+        <w:rPr>
+          <w:rFonts w:ascii="Calibri" w:cs="Calibri" w:eastAsia="Calibri" w:hAnsi="Calibri"/>
+          <w:b/>
+          <w:bCs/>
+          <w:color w:val="1B5E3B"/>
+          <w:sz w:val="28"/>
+          <w:szCs w:val="28"/>
+        </w:rPr>
+        <w:t xml:space="preserve">10bis.1 Page de connexion Admin</w:t>
+      </w:r>
+    </w:p>
+    <w:p>
+      <w:pPr>
+        <w:spacing w:after="40" w:before="40"/>
+      </w:pPr>
+    </w:p>
+    <w:tbl>
+      <w:tblPr>
+        <w:tblW w:type="dxa" w:w="9000"/>
+        <w:tblBorders>
+          <w:top w:val="single" w:color="auto" w:sz="4"/>
+          <w:left w:val="single" w:color="auto" w:sz="4"/>
+          <w:bottom w:val="single" w:color="auto" w:sz="4"/>
+          <w:right w:val="single" w:color="auto" w:sz="4"/>
+          <w:insideH w:val="single" w:color="auto" w:sz="4"/>
+          <w:insideV w:val="single" w:color="auto" w:sz="4"/>
+        </w:tblBorders>
+      </w:tblPr>
+      <w:tblGrid>
+        <w:gridCol w:w="9000"/>
+      </w:tblGrid>
+      <w:tr>
+        <w:trPr>
+          <w:trHeight w:val="300" w:hRule="exact"/>
+        </w:trPr>
+        <w:tc>
+          <w:tcPr>
+            <w:tcW w:type="dxa" w:w="9000"/>
+            <w:tcBorders>
+              <w:top w:val="single" w:color="333333" w:sz="4"/>
+              <w:left w:val="single" w:color="333333" w:sz="4"/>
+              <w:bottom w:val="none"/>
+              <w:right w:val="single" w:color="333333" w:sz="4"/>
+            </w:tcBorders>
+            <w:shd w:fill="2D2D2D" w:val="clear"/>
+          </w:tcPr>
+          <w:p>
+            <w:pPr>
+              <w:spacing w:after="20" w:before="20"/>
+              <w:ind w:left="200"/>
+              <w:jc w:val="left"/>
+            </w:pPr>
+            <w:r>
+              <w:rPr>
+                <w:color w:val="AAAAAA"/>
+                <w:sz w:val="14"/>
+                <w:szCs w:val="14"/>
+              </w:rPr>
+              <w:t xml:space="preserve">●  ●  ●   </w:t>
+            </w:r>
+            <w:r>
+              <w:rPr>
+                <w:color w:val="999999"/>
+                <w:sz w:val="14"/>
+                <w:szCs w:val="14"/>
+              </w:rPr>
+              <w:t xml:space="preserve">  localhost:3000/dashboard</w:t>
+            </w:r>
+          </w:p>
+        </w:tc>
+      </w:tr>
+      <w:tr>
+        <w:trPr>
+          <w:trHeight w:val="4000" w:hRule="atLeast"/>
+        </w:trPr>
+        <w:tc>
+          <w:tcPr>
+            <w:tcW w:type="dxa" w:w="9000"/>
+            <w:tcBorders>
+              <w:top w:val="none"/>
+              <w:left w:val="single" w:color="333333" w:sz="4"/>
+              <w:bottom w:val="single" w:color="333333" w:sz="4"/>
+              <w:right w:val="single" w:color="333333" w:sz="4"/>
+            </w:tcBorders>
+            <w:shd w:fill="FAFAFA" w:val="clear"/>
+            <w:vAlign w:val="center"/>
+          </w:tcPr>
+          <w:p>
+            <w:pPr>
+              <w:spacing w:after="200" w:before="400"/>
+              <w:jc w:val="center"/>
+            </w:pPr>
+            <w:r>
+              <w:rPr>
+                <w:sz w:val="56"/>
+                <w:szCs w:val="56"/>
+              </w:rPr>
+              <w:t xml:space="preserve">🖥️</w:t>
+            </w:r>
+          </w:p>
+          <w:p>
+            <w:pPr>
+              <w:spacing w:after="100" w:before="100"/>
+              <w:jc w:val="center"/>
+            </w:pPr>
+            <w:r>
+              <w:rPr>
+                <w:rFonts w:ascii="Calibri" w:cs="Calibri" w:eastAsia="Calibri" w:hAnsi="Calibri"/>
+                <w:b/>
+                <w:bCs/>
+                <w:color w:val="2E7D5B"/>
+                <w:sz w:val="22"/>
+                <w:szCs w:val="22"/>
+              </w:rPr>
+              <w:t xml:space="preserve">Capture Admin 1</w:t>
+            </w:r>
+          </w:p>
+          <w:p>
+            <w:pPr>
+              <w:spacing w:after="200" w:before="60"/>
+              <w:jc w:val="center"/>
+            </w:pPr>
+            <w:r>
+              <w:rPr>
+                <w:rFonts w:ascii="Calibri" w:cs="Calibri" w:eastAsia="Calibri" w:hAnsi="Calibri"/>
+                <w:color w:val="6B7280"/>
+                <w:sz w:val="18"/>
+                <w:szCs w:val="18"/>
+              </w:rPr>
+              <w:t xml:space="preserve">[Inserer la capture d'ecran de Page de connexion Admin ici]</w:t>
+            </w:r>
+          </w:p>
+        </w:tc>
+      </w:tr>
+    </w:tbl>
+    <w:p>
+      <w:pPr>
+        <w:spacing w:after="60" w:before="60"/>
+      </w:pPr>
+    </w:p>
+    <w:tbl>
+      <w:tblPr>
+        <w:tblW w:type="dxa" w:w="9000"/>
+        <w:tblBorders>
+          <w:top w:val="single" w:color="auto" w:sz="4"/>
+          <w:left w:val="single" w:color="auto" w:sz="4"/>
+          <w:bottom w:val="single" w:color="auto" w:sz="4"/>
+          <w:right w:val="single" w:color="auto" w:sz="4"/>
+          <w:insideH w:val="single" w:color="auto" w:sz="4"/>
+          <w:insideV w:val="single" w:color="auto" w:sz="4"/>
+        </w:tblBorders>
+      </w:tblPr>
+      <w:tblGrid>
+        <w:gridCol w:w="9000"/>
+      </w:tblGrid>
+      <w:tr>
+        <w:tc>
+          <w:tcPr>
+            <w:tcW w:type="dxa" w:w="9000"/>
+            <w:tcBorders>
+              <w:top w:val="none"/>
+              <w:left w:val="single" w:color="2E7D5B" w:sz="6"/>
+              <w:bottom w:val="none"/>
+              <w:right w:val="none"/>
+            </w:tcBorders>
+            <w:shd w:fill="F8FAF9" w:val="clear"/>
+          </w:tcPr>
+          <w:p>
+            <w:pPr>
+              <w:spacing w:after="40" w:before="80"/>
+              <w:ind w:left="200"/>
+            </w:pPr>
+            <w:r>
+              <w:rPr>
+                <w:rFonts w:ascii="Calibri" w:cs="Calibri" w:eastAsia="Calibri" w:hAnsi="Calibri"/>
+                <w:b/>
+                <w:bCs/>
+                <w:color w:val="2E7D5B"/>
+                <w:sz w:val="20"/>
+                <w:szCs w:val="20"/>
+              </w:rPr>
+              <w:t xml:space="preserve">Role de la page :</w:t>
+            </w:r>
+          </w:p>
+          <w:p>
+            <w:pPr>
+              <w:spacing w:after="80" w:before="40"/>
+              <w:ind w:left="200" w:right="200"/>
+            </w:pPr>
+            <w:r>
+              <w:rPr>
+                <w:rFonts w:ascii="Calibri" w:cs="Calibri" w:eastAsia="Calibri" w:hAnsi="Calibri"/>
+                <w:color w:val="1A1A2E"/>
+                <w:sz w:val="20"/>
+                <w:szCs w:val="20"/>
+              </w:rPr>
+              <w:t xml:space="preserve">Point d'entree du panneau d'administration. Formulaire de connexion securise avec email et mot de passe, logo de l'application, et design coherent avec la charte graphique. Acces reserve aux administrateurs de la plateforme.</w:t>
+            </w:r>
+          </w:p>
+        </w:tc>
+      </w:tr>
+    </w:tbl>
+    <w:p>
+      <w:pPr>
+        <w:spacing w:after="60" w:before="60"/>
+      </w:pPr>
+    </w:p>
+    <w:p>
+      <w:pPr>
+        <w:pBdr>
+          <w:bottom w:val="single" w:color="E5E7EB" w:sz="1"/>
+        </w:pBdr>
+        <w:spacing w:after="120" w:before="40"/>
+      </w:pPr>
+    </w:p>
+    <w:p>
+      <w:pPr>
+        <w:pStyle w:val="Heading2"/>
+      </w:pPr>
+      <w:r>
+        <w:rPr>
+          <w:rFonts w:ascii="Calibri" w:cs="Calibri" w:eastAsia="Calibri" w:hAnsi="Calibri"/>
+          <w:b/>
+          <w:bCs/>
+          <w:color w:val="1B5E3B"/>
+          <w:sz w:val="28"/>
+          <w:szCs w:val="28"/>
+        </w:rPr>
+        <w:t xml:space="preserve">10bis.2 Tableau de bord (Dashboard)</w:t>
+      </w:r>
+    </w:p>
+    <w:p>
+      <w:pPr>
+        <w:spacing w:after="40" w:before="40"/>
+      </w:pPr>
+    </w:p>
+    <w:tbl>
+      <w:tblPr>
+        <w:tblW w:type="dxa" w:w="9000"/>
+        <w:tblBorders>
+          <w:top w:val="single" w:color="auto" w:sz="4"/>
+          <w:left w:val="single" w:color="auto" w:sz="4"/>
+          <w:bottom w:val="single" w:color="auto" w:sz="4"/>
+          <w:right w:val="single" w:color="auto" w:sz="4"/>
+          <w:insideH w:val="single" w:color="auto" w:sz="4"/>
+          <w:insideV w:val="single" w:color="auto" w:sz="4"/>
+        </w:tblBorders>
+      </w:tblPr>
+      <w:tblGrid>
+        <w:gridCol w:w="9000"/>
+      </w:tblGrid>
+      <w:tr>
+        <w:trPr>
+          <w:trHeight w:val="300" w:hRule="exact"/>
+        </w:trPr>
+        <w:tc>
+          <w:tcPr>
+            <w:tcW w:type="dxa" w:w="9000"/>
+            <w:tcBorders>
+              <w:top w:val="single" w:color="333333" w:sz="4"/>
+              <w:left w:val="single" w:color="333333" w:sz="4"/>
+              <w:bottom w:val="none"/>
+              <w:right w:val="single" w:color="333333" w:sz="4"/>
+            </w:tcBorders>
+            <w:shd w:fill="2D2D2D" w:val="clear"/>
+          </w:tcPr>
+          <w:p>
+            <w:pPr>
+              <w:spacing w:after="20" w:before="20"/>
+              <w:ind w:left="200"/>
+              <w:jc w:val="left"/>
+            </w:pPr>
+            <w:r>
+              <w:rPr>
+                <w:color w:val="AAAAAA"/>
+                <w:sz w:val="14"/>
+                <w:szCs w:val="14"/>
+              </w:rPr>
+              <w:t xml:space="preserve">●  ●  ●   </w:t>
+            </w:r>
+            <w:r>
+              <w:rPr>
+                <w:color w:val="999999"/>
+                <w:sz w:val="14"/>
+                <w:szCs w:val="14"/>
+              </w:rPr>
+              <w:t xml:space="preserve">  localhost:3000/dashboard</w:t>
+            </w:r>
+          </w:p>
+        </w:tc>
+      </w:tr>
+      <w:tr>
+        <w:trPr>
+          <w:trHeight w:val="4000" w:hRule="atLeast"/>
+        </w:trPr>
+        <w:tc>
+          <w:tcPr>
+            <w:tcW w:type="dxa" w:w="9000"/>
+            <w:tcBorders>
+              <w:top w:val="none"/>
+              <w:left w:val="single" w:color="333333" w:sz="4"/>
+              <w:bottom w:val="single" w:color="333333" w:sz="4"/>
+              <w:right w:val="single" w:color="333333" w:sz="4"/>
+            </w:tcBorders>
+            <w:shd w:fill="FAFAFA" w:val="clear"/>
+            <w:vAlign w:val="center"/>
+          </w:tcPr>
+          <w:p>
+            <w:pPr>
+              <w:spacing w:after="200" w:before="400"/>
+              <w:jc w:val="center"/>
+            </w:pPr>
+            <w:r>
+              <w:rPr>
+                <w:sz w:val="56"/>
+                <w:szCs w:val="56"/>
+              </w:rPr>
+              <w:t xml:space="preserve">🖥️</w:t>
+            </w:r>
+          </w:p>
+          <w:p>
+            <w:pPr>
+              <w:spacing w:after="100" w:before="100"/>
+              <w:jc w:val="center"/>
+            </w:pPr>
+            <w:r>
+              <w:rPr>
+                <w:rFonts w:ascii="Calibri" w:cs="Calibri" w:eastAsia="Calibri" w:hAnsi="Calibri"/>
+                <w:b/>
+                <w:bCs/>
+                <w:color w:val="2E7D5B"/>
+                <w:sz w:val="22"/>
+                <w:szCs w:val="22"/>
+              </w:rPr>
+              <w:t xml:space="preserve">Capture Admin 2</w:t>
+            </w:r>
+          </w:p>
+          <w:p>
+            <w:pPr>
+              <w:spacing w:after="200" w:before="60"/>
+              <w:jc w:val="center"/>
+            </w:pPr>
+            <w:r>
+              <w:rPr>
+                <w:rFonts w:ascii="Calibri" w:cs="Calibri" w:eastAsia="Calibri" w:hAnsi="Calibri"/>
+                <w:color w:val="6B7280"/>
+                <w:sz w:val="18"/>
+                <w:szCs w:val="18"/>
+              </w:rPr>
+              <w:t xml:space="preserve">[Inserer la capture d'ecran de Tableau de bord (Dashboard) ici]</w:t>
+            </w:r>
+          </w:p>
+        </w:tc>
+      </w:tr>
+    </w:tbl>
+    <w:p>
+      <w:pPr>
+        <w:spacing w:after="60" w:before="60"/>
+      </w:pPr>
+    </w:p>
+    <w:tbl>
+      <w:tblPr>
+        <w:tblW w:type="dxa" w:w="9000"/>
+        <w:tblBorders>
+          <w:top w:val="single" w:color="auto" w:sz="4"/>
+          <w:left w:val="single" w:color="auto" w:sz="4"/>
+          <w:bottom w:val="single" w:color="auto" w:sz="4"/>
+          <w:right w:val="single" w:color="auto" w:sz="4"/>
+          <w:insideH w:val="single" w:color="auto" w:sz="4"/>
+          <w:insideV w:val="single" w:color="auto" w:sz="4"/>
+        </w:tblBorders>
+      </w:tblPr>
+      <w:tblGrid>
+        <w:gridCol w:w="9000"/>
+      </w:tblGrid>
+      <w:tr>
+        <w:tc>
+          <w:tcPr>
+            <w:tcW w:type="dxa" w:w="9000"/>
+            <w:tcBorders>
+              <w:top w:val="none"/>
+              <w:left w:val="single" w:color="2E7D5B" w:sz="6"/>
+              <w:bottom w:val="none"/>
+              <w:right w:val="none"/>
+            </w:tcBorders>
+            <w:shd w:fill="F8FAF9" w:val="clear"/>
+          </w:tcPr>
+          <w:p>
+            <w:pPr>
+              <w:spacing w:after="40" w:before="80"/>
+              <w:ind w:left="200"/>
+            </w:pPr>
+            <w:r>
+              <w:rPr>
+                <w:rFonts w:ascii="Calibri" w:cs="Calibri" w:eastAsia="Calibri" w:hAnsi="Calibri"/>
+                <w:b/>
+                <w:bCs/>
+                <w:color w:val="2E7D5B"/>
+                <w:sz w:val="20"/>
+                <w:szCs w:val="20"/>
+              </w:rPr>
+              <w:t xml:space="preserve">Role de la page :</w:t>
+            </w:r>
+          </w:p>
+          <w:p>
+            <w:pPr>
+              <w:spacing w:after="80" w:before="40"/>
+              <w:ind w:left="200" w:right="200"/>
+            </w:pPr>
+            <w:r>
+              <w:rPr>
+                <w:rFonts w:ascii="Calibri" w:cs="Calibri" w:eastAsia="Calibri" w:hAnsi="Calibri"/>
+                <w:color w:val="1A1A2E"/>
+                <w:sz w:val="20"/>
+                <w:szCs w:val="20"/>
+              </w:rPr>
+              <w:t xml:space="preserve">Vue d'ensemble de l'activite de la plateforme. Affiche les statistiques cles (utilisateurs, annonces, conversations, signalements) avec indicateurs de tendance. Graphique d'activite des 7 derniers jours, tableau des annonces en attente de validation, et liste des derniers utilisateurs inscrits.</w:t>
+            </w:r>
+          </w:p>
+        </w:tc>
+      </w:tr>
+    </w:tbl>
+    <w:p>
+      <w:pPr>
+        <w:spacing w:after="60" w:before="60"/>
+      </w:pPr>
+    </w:p>
+    <w:p>
+      <w:pPr>
+        <w:pBdr>
+          <w:bottom w:val="single" w:color="E5E7EB" w:sz="1"/>
+        </w:pBdr>
+        <w:spacing w:after="120" w:before="40"/>
+      </w:pPr>
+    </w:p>
+    <w:p>
+      <w:pPr>
+        <w:pStyle w:val="Heading2"/>
+      </w:pPr>
+      <w:r>
+        <w:rPr>
+          <w:rFonts w:ascii="Calibri" w:cs="Calibri" w:eastAsia="Calibri" w:hAnsi="Calibri"/>
+          <w:b/>
+          <w:bCs/>
+          <w:color w:val="1B5E3B"/>
+          <w:sz w:val="28"/>
+          <w:szCs w:val="28"/>
+        </w:rPr>
+        <w:t xml:space="preserve">10bis.3 Gestion des annonces</w:t>
+      </w:r>
+    </w:p>
+    <w:p>
+      <w:pPr>
+        <w:spacing w:after="40" w:before="40"/>
+      </w:pPr>
+    </w:p>
+    <w:tbl>
+      <w:tblPr>
+        <w:tblW w:type="dxa" w:w="9000"/>
+        <w:tblBorders>
+          <w:top w:val="single" w:color="auto" w:sz="4"/>
+          <w:left w:val="single" w:color="auto" w:sz="4"/>
+          <w:bottom w:val="single" w:color="auto" w:sz="4"/>
+          <w:right w:val="single" w:color="auto" w:sz="4"/>
+          <w:insideH w:val="single" w:color="auto" w:sz="4"/>
+          <w:insideV w:val="single" w:color="auto" w:sz="4"/>
+        </w:tblBorders>
+      </w:tblPr>
+      <w:tblGrid>
+        <w:gridCol w:w="9000"/>
+      </w:tblGrid>
+      <w:tr>
+        <w:trPr>
+          <w:trHeight w:val="300" w:hRule="exact"/>
+        </w:trPr>
+        <w:tc>
+          <w:tcPr>
+            <w:tcW w:type="dxa" w:w="9000"/>
+            <w:tcBorders>
+              <w:top w:val="single" w:color="333333" w:sz="4"/>
+              <w:left w:val="single" w:color="333333" w:sz="4"/>
+              <w:bottom w:val="none"/>
+              <w:right w:val="single" w:color="333333" w:sz="4"/>
+            </w:tcBorders>
+            <w:shd w:fill="2D2D2D" w:val="clear"/>
+          </w:tcPr>
+          <w:p>
+            <w:pPr>
+              <w:spacing w:after="20" w:before="20"/>
+              <w:ind w:left="200"/>
+              <w:jc w:val="left"/>
+            </w:pPr>
+            <w:r>
+              <w:rPr>
+                <w:color w:val="AAAAAA"/>
+                <w:sz w:val="14"/>
+                <w:szCs w:val="14"/>
+              </w:rPr>
+              <w:t xml:space="preserve">●  ●  ●   </w:t>
+            </w:r>
+            <w:r>
+              <w:rPr>
+                <w:color w:val="999999"/>
+                <w:sz w:val="14"/>
+                <w:szCs w:val="14"/>
+              </w:rPr>
+              <w:t xml:space="preserve">  localhost:3000/dashboard</w:t>
+            </w:r>
+          </w:p>
+        </w:tc>
+      </w:tr>
+      <w:tr>
+        <w:trPr>
+          <w:trHeight w:val="4000" w:hRule="atLeast"/>
+        </w:trPr>
+        <w:tc>
+          <w:tcPr>
+            <w:tcW w:type="dxa" w:w="9000"/>
+            <w:tcBorders>
+              <w:top w:val="none"/>
+              <w:left w:val="single" w:color="333333" w:sz="4"/>
+              <w:bottom w:val="single" w:color="333333" w:sz="4"/>
+              <w:right w:val="single" w:color="333333" w:sz="4"/>
+            </w:tcBorders>
+            <w:shd w:fill="FAFAFA" w:val="clear"/>
+            <w:vAlign w:val="center"/>
+          </w:tcPr>
+          <w:p>
+            <w:pPr>
+              <w:spacing w:after="200" w:before="400"/>
+              <w:jc w:val="center"/>
+            </w:pPr>
+            <w:r>
+              <w:rPr>
+                <w:sz w:val="56"/>
+                <w:szCs w:val="56"/>
+              </w:rPr>
+              <w:t xml:space="preserve">🖥️</w:t>
+            </w:r>
+          </w:p>
+          <w:p>
+            <w:pPr>
+              <w:spacing w:after="100" w:before="100"/>
+              <w:jc w:val="center"/>
+            </w:pPr>
+            <w:r>
+              <w:rPr>
+                <w:rFonts w:ascii="Calibri" w:cs="Calibri" w:eastAsia="Calibri" w:hAnsi="Calibri"/>
+                <w:b/>
+                <w:bCs/>
+                <w:color w:val="2E7D5B"/>
+                <w:sz w:val="22"/>
+                <w:szCs w:val="22"/>
+              </w:rPr>
+              <w:t xml:space="preserve">Capture Admin 3</w:t>
+            </w:r>
+          </w:p>
+          <w:p>
+            <w:pPr>
+              <w:spacing w:after="200" w:before="60"/>
+              <w:jc w:val="center"/>
+            </w:pPr>
+            <w:r>
+              <w:rPr>
+                <w:rFonts w:ascii="Calibri" w:cs="Calibri" w:eastAsia="Calibri" w:hAnsi="Calibri"/>
+                <w:color w:val="6B7280"/>
+                <w:sz w:val="18"/>
+                <w:szCs w:val="18"/>
+              </w:rPr>
+              <w:t xml:space="preserve">[Inserer la capture d'ecran de Gestion des annonces ici]</w:t>
+            </w:r>
+          </w:p>
+        </w:tc>
+      </w:tr>
+    </w:tbl>
+    <w:p>
+      <w:pPr>
+        <w:spacing w:after="60" w:before="60"/>
+      </w:pPr>
+    </w:p>
+    <w:tbl>
+      <w:tblPr>
+        <w:tblW w:type="dxa" w:w="9000"/>
+        <w:tblBorders>
+          <w:top w:val="single" w:color="auto" w:sz="4"/>
+          <w:left w:val="single" w:color="auto" w:sz="4"/>
+          <w:bottom w:val="single" w:color="auto" w:sz="4"/>
+          <w:right w:val="single" w:color="auto" w:sz="4"/>
+          <w:insideH w:val="single" w:color="auto" w:sz="4"/>
+          <w:insideV w:val="single" w:color="auto" w:sz="4"/>
+        </w:tblBorders>
+      </w:tblPr>
+      <w:tblGrid>
+        <w:gridCol w:w="9000"/>
+      </w:tblGrid>
+      <w:tr>
+        <w:tc>
+          <w:tcPr>
+            <w:tcW w:type="dxa" w:w="9000"/>
+            <w:tcBorders>
+              <w:top w:val="none"/>
+              <w:left w:val="single" w:color="2E7D5B" w:sz="6"/>
+              <w:bottom w:val="none"/>
+              <w:right w:val="none"/>
+            </w:tcBorders>
+            <w:shd w:fill="F8FAF9" w:val="clear"/>
+          </w:tcPr>
+          <w:p>
+            <w:pPr>
+              <w:spacing w:after="40" w:before="80"/>
+              <w:ind w:left="200"/>
+            </w:pPr>
+            <w:r>
+              <w:rPr>
+                <w:rFonts w:ascii="Calibri" w:cs="Calibri" w:eastAsia="Calibri" w:hAnsi="Calibri"/>
+                <w:b/>
+                <w:bCs/>
+                <w:color w:val="2E7D5B"/>
+                <w:sz w:val="20"/>
+                <w:szCs w:val="20"/>
+              </w:rPr>
+              <w:t xml:space="preserve">Role de la page :</w:t>
+            </w:r>
+          </w:p>
+          <w:p>
+            <w:pPr>
+              <w:spacing w:after="80" w:before="40"/>
+              <w:ind w:left="200" w:right="200"/>
+            </w:pPr>
+            <w:r>
+              <w:rPr>
+                <w:rFonts w:ascii="Calibri" w:cs="Calibri" w:eastAsia="Calibri" w:hAnsi="Calibri"/>
+                <w:color w:val="1A1A2E"/>
+                <w:sz w:val="20"/>
+                <w:szCs w:val="20"/>
+              </w:rPr>
+              <w:t xml:space="preserve">Liste complete de toutes les annonces avec filtres par statut (en attente, actives, rejetees, archivees). Recherche par titre ou quartier, tableau detaille avec proprietaire, prix, statut et actions. Panneau lateral de detail avec validation, rejet, mise en avant ou suppression.</w:t>
+            </w:r>
+          </w:p>
+        </w:tc>
+      </w:tr>
+    </w:tbl>
+    <w:p>
+      <w:pPr>
+        <w:spacing w:after="60" w:before="60"/>
+      </w:pPr>
+    </w:p>
+    <w:p>
+      <w:pPr>
+        <w:pBdr>
+          <w:bottom w:val="single" w:color="E5E7EB" w:sz="1"/>
+        </w:pBdr>
+        <w:spacing w:after="120" w:before="40"/>
+      </w:pPr>
+    </w:p>
+    <w:p>
+      <w:pPr>
+        <w:pStyle w:val="Heading2"/>
+      </w:pPr>
+      <w:r>
+        <w:rPr>
+          <w:rFonts w:ascii="Calibri" w:cs="Calibri" w:eastAsia="Calibri" w:hAnsi="Calibri"/>
+          <w:b/>
+          <w:bCs/>
+          <w:color w:val="1B5E3B"/>
+          <w:sz w:val="28"/>
+          <w:szCs w:val="28"/>
+        </w:rPr>
+        <w:t xml:space="preserve">10bis.4 Gestion des utilisateurs</w:t>
+      </w:r>
+    </w:p>
+    <w:p>
+      <w:pPr>
+        <w:spacing w:after="40" w:before="40"/>
+      </w:pPr>
+    </w:p>
+    <w:tbl>
+      <w:tblPr>
+        <w:tblW w:type="dxa" w:w="9000"/>
+        <w:tblBorders>
+          <w:top w:val="single" w:color="auto" w:sz="4"/>
+          <w:left w:val="single" w:color="auto" w:sz="4"/>
+          <w:bottom w:val="single" w:color="auto" w:sz="4"/>
+          <w:right w:val="single" w:color="auto" w:sz="4"/>
+          <w:insideH w:val="single" w:color="auto" w:sz="4"/>
+          <w:insideV w:val="single" w:color="auto" w:sz="4"/>
+        </w:tblBorders>
+      </w:tblPr>
+      <w:tblGrid>
+        <w:gridCol w:w="9000"/>
+      </w:tblGrid>
+      <w:tr>
+        <w:trPr>
+          <w:trHeight w:val="300" w:hRule="exact"/>
+        </w:trPr>
+        <w:tc>
+          <w:tcPr>
+            <w:tcW w:type="dxa" w:w="9000"/>
+            <w:tcBorders>
+              <w:top w:val="single" w:color="333333" w:sz="4"/>
+              <w:left w:val="single" w:color="333333" w:sz="4"/>
+              <w:bottom w:val="none"/>
+              <w:right w:val="single" w:color="333333" w:sz="4"/>
+            </w:tcBorders>
+            <w:shd w:fill="2D2D2D" w:val="clear"/>
+          </w:tcPr>
+          <w:p>
+            <w:pPr>
+              <w:spacing w:after="20" w:before="20"/>
+              <w:ind w:left="200"/>
+              <w:jc w:val="left"/>
+            </w:pPr>
+            <w:r>
+              <w:rPr>
+                <w:color w:val="AAAAAA"/>
+                <w:sz w:val="14"/>
+                <w:szCs w:val="14"/>
+              </w:rPr>
+              <w:t xml:space="preserve">●  ●  ●   </w:t>
+            </w:r>
+            <w:r>
+              <w:rPr>
+                <w:color w:val="999999"/>
+                <w:sz w:val="14"/>
+                <w:szCs w:val="14"/>
+              </w:rPr>
+              <w:t xml:space="preserve">  localhost:3000/dashboard</w:t>
+            </w:r>
+          </w:p>
+        </w:tc>
+      </w:tr>
+      <w:tr>
+        <w:trPr>
+          <w:trHeight w:val="4000" w:hRule="atLeast"/>
+        </w:trPr>
+        <w:tc>
+          <w:tcPr>
+            <w:tcW w:type="dxa" w:w="9000"/>
+            <w:tcBorders>
+              <w:top w:val="none"/>
+              <w:left w:val="single" w:color="333333" w:sz="4"/>
+              <w:bottom w:val="single" w:color="333333" w:sz="4"/>
+              <w:right w:val="single" w:color="333333" w:sz="4"/>
+            </w:tcBorders>
+            <w:shd w:fill="FAFAFA" w:val="clear"/>
+            <w:vAlign w:val="center"/>
+          </w:tcPr>
+          <w:p>
+            <w:pPr>
+              <w:spacing w:after="200" w:before="400"/>
+              <w:jc w:val="center"/>
+            </w:pPr>
+            <w:r>
+              <w:rPr>
+                <w:sz w:val="56"/>
+                <w:szCs w:val="56"/>
+              </w:rPr>
+              <w:t xml:space="preserve">🖥️</w:t>
+            </w:r>
+          </w:p>
+          <w:p>
+            <w:pPr>
+              <w:spacing w:after="100" w:before="100"/>
+              <w:jc w:val="center"/>
+            </w:pPr>
+            <w:r>
+              <w:rPr>
+                <w:rFonts w:ascii="Calibri" w:cs="Calibri" w:eastAsia="Calibri" w:hAnsi="Calibri"/>
+                <w:b/>
+                <w:bCs/>
+                <w:color w:val="2E7D5B"/>
+                <w:sz w:val="22"/>
+                <w:szCs w:val="22"/>
+              </w:rPr>
+              <w:t xml:space="preserve">Capture Admin 4</w:t>
+            </w:r>
+          </w:p>
+          <w:p>
+            <w:pPr>
+              <w:spacing w:after="200" w:before="60"/>
+              <w:jc w:val="center"/>
+            </w:pPr>
+            <w:r>
+              <w:rPr>
+                <w:rFonts w:ascii="Calibri" w:cs="Calibri" w:eastAsia="Calibri" w:hAnsi="Calibri"/>
+                <w:color w:val="6B7280"/>
+                <w:sz w:val="18"/>
+                <w:szCs w:val="18"/>
+              </w:rPr>
+              <w:t xml:space="preserve">[Inserer la capture d'ecran de Gestion des utilisateurs ici]</w:t>
+            </w:r>
+          </w:p>
+        </w:tc>
+      </w:tr>
+    </w:tbl>
+    <w:p>
+      <w:pPr>
+        <w:spacing w:after="60" w:before="60"/>
+      </w:pPr>
+    </w:p>
+    <w:tbl>
+      <w:tblPr>
+        <w:tblW w:type="dxa" w:w="9000"/>
+        <w:tblBorders>
+          <w:top w:val="single" w:color="auto" w:sz="4"/>
+          <w:left w:val="single" w:color="auto" w:sz="4"/>
+          <w:bottom w:val="single" w:color="auto" w:sz="4"/>
+          <w:right w:val="single" w:color="auto" w:sz="4"/>
+          <w:insideH w:val="single" w:color="auto" w:sz="4"/>
+          <w:insideV w:val="single" w:color="auto" w:sz="4"/>
+        </w:tblBorders>
+      </w:tblPr>
+      <w:tblGrid>
+        <w:gridCol w:w="9000"/>
+      </w:tblGrid>
+      <w:tr>
+        <w:tc>
+          <w:tcPr>
+            <w:tcW w:type="dxa" w:w="9000"/>
+            <w:tcBorders>
+              <w:top w:val="none"/>
+              <w:left w:val="single" w:color="2E7D5B" w:sz="6"/>
+              <w:bottom w:val="none"/>
+              <w:right w:val="none"/>
+            </w:tcBorders>
+            <w:shd w:fill="F8FAF9" w:val="clear"/>
+          </w:tcPr>
+          <w:p>
+            <w:pPr>
+              <w:spacing w:after="40" w:before="80"/>
+              <w:ind w:left="200"/>
+            </w:pPr>
+            <w:r>
+              <w:rPr>
+                <w:rFonts w:ascii="Calibri" w:cs="Calibri" w:eastAsia="Calibri" w:hAnsi="Calibri"/>
+                <w:b/>
+                <w:bCs/>
+                <w:color w:val="2E7D5B"/>
+                <w:sz w:val="20"/>
+                <w:szCs w:val="20"/>
+              </w:rPr>
+              <w:t xml:space="preserve">Role de la page :</w:t>
+            </w:r>
+          </w:p>
+          <w:p>
+            <w:pPr>
+              <w:spacing w:after="80" w:before="40"/>
+              <w:ind w:left="200" w:right="200"/>
+            </w:pPr>
+            <w:r>
+              <w:rPr>
+                <w:rFonts w:ascii="Calibri" w:cs="Calibri" w:eastAsia="Calibri" w:hAnsi="Calibri"/>
+                <w:color w:val="1A1A2E"/>
+                <w:sz w:val="20"/>
+                <w:szCs w:val="20"/>
+              </w:rPr>
+              <w:t xml:space="preserve">Repertoire de tous les utilisateurs de la plateforme avec filtres par role (locataire, proprietaire) et statut (verifie, suspendu). Tableau avec avatar, informations de contact, role, date d'inscription et actions de moderation (verification, suspension, suppression).</w:t>
+            </w:r>
+          </w:p>
+        </w:tc>
+      </w:tr>
+    </w:tbl>
+    <w:p>
+      <w:pPr>
+        <w:spacing w:after="60" w:before="60"/>
+      </w:pPr>
+    </w:p>
+    <w:p>
+      <w:pPr>
+        <w:pBdr>
+          <w:bottom w:val="single" w:color="E5E7EB" w:sz="1"/>
+        </w:pBdr>
+        <w:spacing w:after="120" w:before="40"/>
+      </w:pPr>
+    </w:p>
+    <w:p>
+      <w:pPr>
+        <w:pStyle w:val="Heading2"/>
+      </w:pPr>
+      <w:r>
+        <w:rPr>
+          <w:rFonts w:ascii="Calibri" w:cs="Calibri" w:eastAsia="Calibri" w:hAnsi="Calibri"/>
+          <w:b/>
+          <w:bCs/>
+          <w:color w:val="1B5E3B"/>
+          <w:sz w:val="28"/>
+          <w:szCs w:val="28"/>
+        </w:rPr>
+        <w:t xml:space="preserve">10bis.5 Suivi des conversations</w:t>
+      </w:r>
+    </w:p>
+    <w:p>
+      <w:pPr>
+        <w:spacing w:after="40" w:before="40"/>
+      </w:pPr>
+    </w:p>
+    <w:tbl>
+      <w:tblPr>
+        <w:tblW w:type="dxa" w:w="9000"/>
+        <w:tblBorders>
+          <w:top w:val="single" w:color="auto" w:sz="4"/>
+          <w:left w:val="single" w:color="auto" w:sz="4"/>
+          <w:bottom w:val="single" w:color="auto" w:sz="4"/>
+          <w:right w:val="single" w:color="auto" w:sz="4"/>
+          <w:insideH w:val="single" w:color="auto" w:sz="4"/>
+          <w:insideV w:val="single" w:color="auto" w:sz="4"/>
+        </w:tblBorders>
+      </w:tblPr>
+      <w:tblGrid>
+        <w:gridCol w:w="9000"/>
+      </w:tblGrid>
+      <w:tr>
+        <w:trPr>
+          <w:trHeight w:val="300" w:hRule="exact"/>
+        </w:trPr>
+        <w:tc>
+          <w:tcPr>
+            <w:tcW w:type="dxa" w:w="9000"/>
+            <w:tcBorders>
+              <w:top w:val="single" w:color="333333" w:sz="4"/>
+              <w:left w:val="single" w:color="333333" w:sz="4"/>
+              <w:bottom w:val="none"/>
+              <w:right w:val="single" w:color="333333" w:sz="4"/>
+            </w:tcBorders>
+            <w:shd w:fill="2D2D2D" w:val="clear"/>
+          </w:tcPr>
+          <w:p>
+            <w:pPr>
+              <w:spacing w:after="20" w:before="20"/>
+              <w:ind w:left="200"/>
+              <w:jc w:val="left"/>
+            </w:pPr>
+            <w:r>
+              <w:rPr>
+                <w:color w:val="AAAAAA"/>
+                <w:sz w:val="14"/>
+                <w:szCs w:val="14"/>
+              </w:rPr>
+              <w:t xml:space="preserve">●  ●  ●   </w:t>
+            </w:r>
+            <w:r>
+              <w:rPr>
+                <w:color w:val="999999"/>
+                <w:sz w:val="14"/>
+                <w:szCs w:val="14"/>
+              </w:rPr>
+              <w:t xml:space="preserve">  localhost:3000/dashboard</w:t>
+            </w:r>
+          </w:p>
+        </w:tc>
+      </w:tr>
+      <w:tr>
+        <w:trPr>
+          <w:trHeight w:val="4000" w:hRule="atLeast"/>
+        </w:trPr>
+        <w:tc>
+          <w:tcPr>
+            <w:tcW w:type="dxa" w:w="9000"/>
+            <w:tcBorders>
+              <w:top w:val="none"/>
+              <w:left w:val="single" w:color="333333" w:sz="4"/>
+              <w:bottom w:val="single" w:color="333333" w:sz="4"/>
+              <w:right w:val="single" w:color="333333" w:sz="4"/>
+            </w:tcBorders>
+            <w:shd w:fill="FAFAFA" w:val="clear"/>
+            <w:vAlign w:val="center"/>
+          </w:tcPr>
+          <w:p>
+            <w:pPr>
+              <w:spacing w:after="200" w:before="400"/>
+              <w:jc w:val="center"/>
+            </w:pPr>
+            <w:r>
+              <w:rPr>
+                <w:sz w:val="56"/>
+                <w:szCs w:val="56"/>
+              </w:rPr>
+              <w:t xml:space="preserve">🖥️</w:t>
+            </w:r>
+          </w:p>
+          <w:p>
+            <w:pPr>
+              <w:spacing w:after="100" w:before="100"/>
+              <w:jc w:val="center"/>
+            </w:pPr>
+            <w:r>
+              <w:rPr>
+                <w:rFonts w:ascii="Calibri" w:cs="Calibri" w:eastAsia="Calibri" w:hAnsi="Calibri"/>
+                <w:b/>
+                <w:bCs/>
+                <w:color w:val="2E7D5B"/>
+                <w:sz w:val="22"/>
+                <w:szCs w:val="22"/>
+              </w:rPr>
+              <w:t xml:space="preserve">Capture Admin 5</w:t>
+            </w:r>
+          </w:p>
+          <w:p>
+            <w:pPr>
+              <w:spacing w:after="200" w:before="60"/>
+              <w:jc w:val="center"/>
+            </w:pPr>
+            <w:r>
+              <w:rPr>
+                <w:rFonts w:ascii="Calibri" w:cs="Calibri" w:eastAsia="Calibri" w:hAnsi="Calibri"/>
+                <w:color w:val="6B7280"/>
+                <w:sz w:val="18"/>
+                <w:szCs w:val="18"/>
+              </w:rPr>
+              <w:t xml:space="preserve">[Inserer la capture d'ecran de Suivi des conversations ici]</w:t>
+            </w:r>
+          </w:p>
+        </w:tc>
+      </w:tr>
+    </w:tbl>
+    <w:p>
+      <w:pPr>
+        <w:spacing w:after="60" w:before="60"/>
+      </w:pPr>
+    </w:p>
+    <w:tbl>
+      <w:tblPr>
+        <w:tblW w:type="dxa" w:w="9000"/>
+        <w:tblBorders>
+          <w:top w:val="single" w:color="auto" w:sz="4"/>
+          <w:left w:val="single" w:color="auto" w:sz="4"/>
+          <w:bottom w:val="single" w:color="auto" w:sz="4"/>
+          <w:right w:val="single" w:color="auto" w:sz="4"/>
+          <w:insideH w:val="single" w:color="auto" w:sz="4"/>
+          <w:insideV w:val="single" w:color="auto" w:sz="4"/>
+        </w:tblBorders>
+      </w:tblPr>
+      <w:tblGrid>
+        <w:gridCol w:w="9000"/>
+      </w:tblGrid>
+      <w:tr>
+        <w:tc>
+          <w:tcPr>
+            <w:tcW w:type="dxa" w:w="9000"/>
+            <w:tcBorders>
+              <w:top w:val="none"/>
+              <w:left w:val="single" w:color="2E7D5B" w:sz="6"/>
+              <w:bottom w:val="none"/>
+              <w:right w:val="none"/>
+            </w:tcBorders>
+            <w:shd w:fill="F8FAF9" w:val="clear"/>
+          </w:tcPr>
+          <w:p>
+            <w:pPr>
+              <w:spacing w:after="40" w:before="80"/>
+              <w:ind w:left="200"/>
+            </w:pPr>
+            <w:r>
+              <w:rPr>
+                <w:rFonts w:ascii="Calibri" w:cs="Calibri" w:eastAsia="Calibri" w:hAnsi="Calibri"/>
+                <w:b/>
+                <w:bCs/>
+                <w:color w:val="2E7D5B"/>
+                <w:sz w:val="20"/>
+                <w:szCs w:val="20"/>
+              </w:rPr>
+              <w:t xml:space="preserve">Role de la page :</w:t>
+            </w:r>
+          </w:p>
+          <w:p>
+            <w:pPr>
+              <w:spacing w:after="80" w:before="40"/>
+              <w:ind w:left="200" w:right="200"/>
+            </w:pPr>
+            <w:r>
+              <w:rPr>
+                <w:rFonts w:ascii="Calibri" w:cs="Calibri" w:eastAsia="Calibri" w:hAnsi="Calibri"/>
+                <w:color w:val="1A1A2E"/>
+                <w:sz w:val="20"/>
+                <w:szCs w:val="20"/>
+              </w:rPr>
+              <w:t xml:space="preserve">Visualisation de toutes les conversations entre utilisateurs. Liste avec apercu du dernier message, participants, logement concerne et indicateur de messages non lus. Panneau de lecture des messages pour la moderation du contenu.</w:t>
+            </w:r>
+          </w:p>
+        </w:tc>
+      </w:tr>
+    </w:tbl>
+    <w:p>
+      <w:pPr>
+        <w:spacing w:after="60" w:before="60"/>
+      </w:pPr>
+    </w:p>
+    <w:p>
+      <w:pPr>
+        <w:pBdr>
+          <w:bottom w:val="single" w:color="E5E7EB" w:sz="1"/>
+        </w:pBdr>
+        <w:spacing w:after="120" w:before="40"/>
+      </w:pPr>
+    </w:p>
+    <w:p>
+      <w:pPr>
+        <w:pStyle w:val="Heading2"/>
+      </w:pPr>
+      <w:r>
+        <w:rPr>
+          <w:rFonts w:ascii="Calibri" w:cs="Calibri" w:eastAsia="Calibri" w:hAnsi="Calibri"/>
+          <w:b/>
+          <w:bCs/>
+          <w:color w:val="1B5E3B"/>
+          <w:sz w:val="28"/>
+          <w:szCs w:val="28"/>
+        </w:rPr>
+        <w:t xml:space="preserve">10bis.6 Gestion des signalements</w:t>
+      </w:r>
+    </w:p>
+    <w:p>
+      <w:pPr>
+        <w:spacing w:after="40" w:before="40"/>
+      </w:pPr>
+    </w:p>
+    <w:tbl>
+      <w:tblPr>
+        <w:tblW w:type="dxa" w:w="9000"/>
+        <w:tblBorders>
+          <w:top w:val="single" w:color="auto" w:sz="4"/>
+          <w:left w:val="single" w:color="auto" w:sz="4"/>
+          <w:bottom w:val="single" w:color="auto" w:sz="4"/>
+          <w:right w:val="single" w:color="auto" w:sz="4"/>
+          <w:insideH w:val="single" w:color="auto" w:sz="4"/>
+          <w:insideV w:val="single" w:color="auto" w:sz="4"/>
+        </w:tblBorders>
+      </w:tblPr>
+      <w:tblGrid>
+        <w:gridCol w:w="9000"/>
+      </w:tblGrid>
+      <w:tr>
+        <w:trPr>
+          <w:trHeight w:val="300" w:hRule="exact"/>
+        </w:trPr>
+        <w:tc>
+          <w:tcPr>
+            <w:tcW w:type="dxa" w:w="9000"/>
+            <w:tcBorders>
+              <w:top w:val="single" w:color="333333" w:sz="4"/>
+              <w:left w:val="single" w:color="333333" w:sz="4"/>
+              <w:bottom w:val="none"/>
+              <w:right w:val="single" w:color="333333" w:sz="4"/>
+            </w:tcBorders>
+            <w:shd w:fill="2D2D2D" w:val="clear"/>
+          </w:tcPr>
+          <w:p>
+            <w:pPr>
+              <w:spacing w:after="20" w:before="20"/>
+              <w:ind w:left="200"/>
+              <w:jc w:val="left"/>
+            </w:pPr>
+            <w:r>
+              <w:rPr>
+                <w:color w:val="AAAAAA"/>
+                <w:sz w:val="14"/>
+                <w:szCs w:val="14"/>
+              </w:rPr>
+              <w:t xml:space="preserve">●  ●  ●   </w:t>
+            </w:r>
+            <w:r>
+              <w:rPr>
+                <w:color w:val="999999"/>
+                <w:sz w:val="14"/>
+                <w:szCs w:val="14"/>
+              </w:rPr>
+              <w:t xml:space="preserve">  localhost:3000/dashboard</w:t>
+            </w:r>
+          </w:p>
+        </w:tc>
+      </w:tr>
+      <w:tr>
+        <w:trPr>
+          <w:trHeight w:val="4000" w:hRule="atLeast"/>
+        </w:trPr>
+        <w:tc>
+          <w:tcPr>
+            <w:tcW w:type="dxa" w:w="9000"/>
+            <w:tcBorders>
+              <w:top w:val="none"/>
+              <w:left w:val="single" w:color="333333" w:sz="4"/>
+              <w:bottom w:val="single" w:color="333333" w:sz="4"/>
+              <w:right w:val="single" w:color="333333" w:sz="4"/>
+            </w:tcBorders>
+            <w:shd w:fill="FAFAFA" w:val="clear"/>
+            <w:vAlign w:val="center"/>
+          </w:tcPr>
+          <w:p>
+            <w:pPr>
+              <w:spacing w:after="200" w:before="400"/>
+              <w:jc w:val="center"/>
+            </w:pPr>
+            <w:r>
+              <w:rPr>
+                <w:sz w:val="56"/>
+                <w:szCs w:val="56"/>
+              </w:rPr>
+              <w:t xml:space="preserve">🖥️</w:t>
+            </w:r>
+          </w:p>
+          <w:p>
+            <w:pPr>
+              <w:spacing w:after="100" w:before="100"/>
+              <w:jc w:val="center"/>
+            </w:pPr>
+            <w:r>
+              <w:rPr>
+                <w:rFonts w:ascii="Calibri" w:cs="Calibri" w:eastAsia="Calibri" w:hAnsi="Calibri"/>
+                <w:b/>
+                <w:bCs/>
+                <w:color w:val="2E7D5B"/>
+                <w:sz w:val="22"/>
+                <w:szCs w:val="22"/>
+              </w:rPr>
+              <w:t xml:space="preserve">Capture Admin 6</w:t>
+            </w:r>
+          </w:p>
+          <w:p>
+            <w:pPr>
+              <w:spacing w:after="200" w:before="60"/>
+              <w:jc w:val="center"/>
+            </w:pPr>
+            <w:r>
+              <w:rPr>
+                <w:rFonts w:ascii="Calibri" w:cs="Calibri" w:eastAsia="Calibri" w:hAnsi="Calibri"/>
+                <w:color w:val="6B7280"/>
+                <w:sz w:val="18"/>
+                <w:szCs w:val="18"/>
+              </w:rPr>
+              <w:t xml:space="preserve">[Inserer la capture d'ecran de Gestion des signalements ici]</w:t>
+            </w:r>
+          </w:p>
+        </w:tc>
+      </w:tr>
+    </w:tbl>
+    <w:p>
+      <w:pPr>
+        <w:spacing w:after="60" w:before="60"/>
+      </w:pPr>
+    </w:p>
+    <w:tbl>
+      <w:tblPr>
+        <w:tblW w:type="dxa" w:w="9000"/>
+        <w:tblBorders>
+          <w:top w:val="single" w:color="auto" w:sz="4"/>
+          <w:left w:val="single" w:color="auto" w:sz="4"/>
+          <w:bottom w:val="single" w:color="auto" w:sz="4"/>
+          <w:right w:val="single" w:color="auto" w:sz="4"/>
+          <w:insideH w:val="single" w:color="auto" w:sz="4"/>
+          <w:insideV w:val="single" w:color="auto" w:sz="4"/>
+        </w:tblBorders>
+      </w:tblPr>
+      <w:tblGrid>
+        <w:gridCol w:w="9000"/>
+      </w:tblGrid>
+      <w:tr>
+        <w:tc>
+          <w:tcPr>
+            <w:tcW w:type="dxa" w:w="9000"/>
+            <w:tcBorders>
+              <w:top w:val="none"/>
+              <w:left w:val="single" w:color="2E7D5B" w:sz="6"/>
+              <w:bottom w:val="none"/>
+              <w:right w:val="none"/>
+            </w:tcBorders>
+            <w:shd w:fill="F8FAF9" w:val="clear"/>
+          </w:tcPr>
+          <w:p>
+            <w:pPr>
+              <w:spacing w:after="40" w:before="80"/>
+              <w:ind w:left="200"/>
+            </w:pPr>
+            <w:r>
+              <w:rPr>
+                <w:rFonts w:ascii="Calibri" w:cs="Calibri" w:eastAsia="Calibri" w:hAnsi="Calibri"/>
+                <w:b/>
+                <w:bCs/>
+                <w:color w:val="2E7D5B"/>
+                <w:sz w:val="20"/>
+                <w:szCs w:val="20"/>
+              </w:rPr>
+              <w:t xml:space="preserve">Role de la page :</w:t>
+            </w:r>
+          </w:p>
+          <w:p>
+            <w:pPr>
+              <w:spacing w:after="80" w:before="40"/>
+              <w:ind w:left="200" w:right="200"/>
+            </w:pPr>
+            <w:r>
+              <w:rPr>
+                <w:rFonts w:ascii="Calibri" w:cs="Calibri" w:eastAsia="Calibri" w:hAnsi="Calibri"/>
+                <w:color w:val="1A1A2E"/>
+                <w:sz w:val="20"/>
+                <w:szCs w:val="20"/>
+              </w:rPr>
+              <w:t xml:space="preserve">Interface de moderation des signalements effectues par les utilisateurs. Filtres par statut (en attente, traites, rejetes), tableau avec motif, annonce signalee, signaleur et date. Actions : marquer comme traite, rejeter le signalement, ou supprimer l'annonce concernee.</w:t>
+            </w:r>
+          </w:p>
+        </w:tc>
+      </w:tr>
+    </w:tbl>
+    <w:p>
+      <w:pPr>
+        <w:spacing w:after="60" w:before="60"/>
+      </w:pPr>
+    </w:p>
+    <w:p>
+      <w:pPr>
+        <w:pBdr>
+          <w:bottom w:val="single" w:color="E5E7EB" w:sz="1"/>
+        </w:pBdr>
+        <w:spacing w:after="120" w:before="40"/>
+      </w:pPr>
+    </w:p>
+    <w:p>
+      <w:pPr>
+        <w:pStyle w:val="Heading2"/>
+      </w:pPr>
+      <w:r>
+        <w:rPr>
+          <w:rFonts w:ascii="Calibri" w:cs="Calibri" w:eastAsia="Calibri" w:hAnsi="Calibri"/>
+          <w:b/>
+          <w:bCs/>
+          <w:color w:val="1B5E3B"/>
+          <w:sz w:val="28"/>
+          <w:szCs w:val="28"/>
+        </w:rPr>
+        <w:t xml:space="preserve">10bis.7 Parametres de la plateforme</w:t>
+      </w:r>
+    </w:p>
+    <w:p>
+      <w:pPr>
+        <w:spacing w:after="40" w:before="40"/>
+      </w:pPr>
+    </w:p>
+    <w:tbl>
+      <w:tblPr>
+        <w:tblW w:type="dxa" w:w="9000"/>
+        <w:tblBorders>
+          <w:top w:val="single" w:color="auto" w:sz="4"/>
+          <w:left w:val="single" w:color="auto" w:sz="4"/>
+          <w:bottom w:val="single" w:color="auto" w:sz="4"/>
+          <w:right w:val="single" w:color="auto" w:sz="4"/>
+          <w:insideH w:val="single" w:color="auto" w:sz="4"/>
+          <w:insideV w:val="single" w:color="auto" w:sz="4"/>
+        </w:tblBorders>
+      </w:tblPr>
+      <w:tblGrid>
+        <w:gridCol w:w="9000"/>
+      </w:tblGrid>
+      <w:tr>
+        <w:trPr>
+          <w:trHeight w:val="300" w:hRule="exact"/>
+        </w:trPr>
+        <w:tc>
+          <w:tcPr>
+            <w:tcW w:type="dxa" w:w="9000"/>
+            <w:tcBorders>
+              <w:top w:val="single" w:color="333333" w:sz="4"/>
+              <w:left w:val="single" w:color="333333" w:sz="4"/>
+              <w:bottom w:val="none"/>
+              <w:right w:val="single" w:color="333333" w:sz="4"/>
+            </w:tcBorders>
+            <w:shd w:fill="2D2D2D" w:val="clear"/>
+          </w:tcPr>
+          <w:p>
+            <w:pPr>
+              <w:spacing w:after="20" w:before="20"/>
+              <w:ind w:left="200"/>
+              <w:jc w:val="left"/>
+            </w:pPr>
+            <w:r>
+              <w:rPr>
+                <w:color w:val="AAAAAA"/>
+                <w:sz w:val="14"/>
+                <w:szCs w:val="14"/>
+              </w:rPr>
+              <w:t xml:space="preserve">●  ●  ●   </w:t>
+            </w:r>
+            <w:r>
+              <w:rPr>
+                <w:color w:val="999999"/>
+                <w:sz w:val="14"/>
+                <w:szCs w:val="14"/>
+              </w:rPr>
+              <w:t xml:space="preserve">  localhost:3000/dashboard</w:t>
+            </w:r>
+          </w:p>
+        </w:tc>
+      </w:tr>
+      <w:tr>
+        <w:trPr>
+          <w:trHeight w:val="4000" w:hRule="atLeast"/>
+        </w:trPr>
+        <w:tc>
+          <w:tcPr>
+            <w:tcW w:type="dxa" w:w="9000"/>
+            <w:tcBorders>
+              <w:top w:val="none"/>
+              <w:left w:val="single" w:color="333333" w:sz="4"/>
+              <w:bottom w:val="single" w:color="333333" w:sz="4"/>
+              <w:right w:val="single" w:color="333333" w:sz="4"/>
+            </w:tcBorders>
+            <w:shd w:fill="FAFAFA" w:val="clear"/>
+            <w:vAlign w:val="center"/>
+          </w:tcPr>
+          <w:p>
+            <w:pPr>
+              <w:spacing w:after="200" w:before="400"/>
+              <w:jc w:val="center"/>
+            </w:pPr>
+            <w:r>
+              <w:rPr>
+                <w:sz w:val="56"/>
+                <w:szCs w:val="56"/>
+              </w:rPr>
+              <w:t xml:space="preserve">🖥️</w:t>
+            </w:r>
+          </w:p>
+          <w:p>
+            <w:pPr>
+              <w:spacing w:after="100" w:before="100"/>
+              <w:jc w:val="center"/>
+            </w:pPr>
+            <w:r>
+              <w:rPr>
+                <w:rFonts w:ascii="Calibri" w:cs="Calibri" w:eastAsia="Calibri" w:hAnsi="Calibri"/>
+                <w:b/>
+                <w:bCs/>
+                <w:color w:val="2E7D5B"/>
+                <w:sz w:val="22"/>
+                <w:szCs w:val="22"/>
+              </w:rPr>
+              <w:t xml:space="preserve">Capture Admin 7</w:t>
+            </w:r>
+          </w:p>
+          <w:p>
+            <w:pPr>
+              <w:spacing w:after="200" w:before="60"/>
+              <w:jc w:val="center"/>
+            </w:pPr>
+            <w:r>
+              <w:rPr>
+                <w:rFonts w:ascii="Calibri" w:cs="Calibri" w:eastAsia="Calibri" w:hAnsi="Calibri"/>
+                <w:color w:val="6B7280"/>
+                <w:sz w:val="18"/>
+                <w:szCs w:val="18"/>
+              </w:rPr>
+              <w:t xml:space="preserve">[Inserer la capture d'ecran de Parametres de la plateforme ici]</w:t>
+            </w:r>
+          </w:p>
+        </w:tc>
+      </w:tr>
+    </w:tbl>
+    <w:p>
+      <w:pPr>
+        <w:spacing w:after="60" w:before="60"/>
+      </w:pPr>
+    </w:p>
+    <w:tbl>
+      <w:tblPr>
+        <w:tblW w:type="dxa" w:w="9000"/>
+        <w:tblBorders>
+          <w:top w:val="single" w:color="auto" w:sz="4"/>
+          <w:left w:val="single" w:color="auto" w:sz="4"/>
+          <w:bottom w:val="single" w:color="auto" w:sz="4"/>
+          <w:right w:val="single" w:color="auto" w:sz="4"/>
+          <w:insideH w:val="single" w:color="auto" w:sz="4"/>
+          <w:insideV w:val="single" w:color="auto" w:sz="4"/>
+        </w:tblBorders>
+      </w:tblPr>
+      <w:tblGrid>
+        <w:gridCol w:w="9000"/>
+      </w:tblGrid>
+      <w:tr>
+        <w:tc>
+          <w:tcPr>
+            <w:tcW w:type="dxa" w:w="9000"/>
+            <w:tcBorders>
+              <w:top w:val="none"/>
+              <w:left w:val="single" w:color="2E7D5B" w:sz="6"/>
+              <w:bottom w:val="none"/>
+              <w:right w:val="none"/>
+            </w:tcBorders>
+            <w:shd w:fill="F8FAF9" w:val="clear"/>
+          </w:tcPr>
+          <w:p>
+            <w:pPr>
+              <w:spacing w:after="40" w:before="80"/>
+              <w:ind w:left="200"/>
+            </w:pPr>
+            <w:r>
+              <w:rPr>
+                <w:rFonts w:ascii="Calibri" w:cs="Calibri" w:eastAsia="Calibri" w:hAnsi="Calibri"/>
+                <w:b/>
+                <w:bCs/>
+                <w:color w:val="2E7D5B"/>
+                <w:sz w:val="20"/>
+                <w:szCs w:val="20"/>
+              </w:rPr>
+              <w:t xml:space="preserve">Role de la page :</w:t>
+            </w:r>
+          </w:p>
+          <w:p>
+            <w:pPr>
+              <w:spacing w:after="80" w:before="40"/>
+              <w:ind w:left="200" w:right="200"/>
+            </w:pPr>
+            <w:r>
+              <w:rPr>
+                <w:rFonts w:ascii="Calibri" w:cs="Calibri" w:eastAsia="Calibri" w:hAnsi="Calibri"/>
+                <w:color w:val="1A1A2E"/>
+                <w:sz w:val="20"/>
+                <w:szCs w:val="20"/>
+              </w:rPr>
+              <w:t xml:space="preserve">Configuration generale de la plateforme : informations (nom, email de support), moderation (approbation manuelle, filtrage automatique), notifications (emails admin, alertes signalements). Zone de danger pour la purge des donnees et la maintenance.</w:t>
+            </w:r>
+          </w:p>
+        </w:tc>
+      </w:tr>
+    </w:tbl>
+    <w:p>
+      <w:pPr>
+        <w:spacing w:after="60" w:before="60"/>
+      </w:pPr>
+    </w:p>
+    <w:p>
+      <w:pPr>
+        <w:pBdr>
+          <w:bottom w:val="single" w:color="E5E7EB" w:sz="1"/>
+        </w:pBdr>
+        <w:spacing w:after="120" w:before="40"/>
+      </w:pPr>
+    </w:p>
+    <w:p>
+      <w:r>
+        <w:br w:type="page"/>
+      </w:r>
+    </w:p>
+    <w:p>
+      <w:pPr>
+        <w:pStyle w:val="Heading1"/>
+      </w:pPr>
+      <w:r>
+        <w:rPr>
+          <w:rFonts w:ascii="Calibri" w:cs="Calibri" w:eastAsia="Calibri" w:hAnsi="Calibri"/>
+          <w:b/>
+          <w:bCs/>
+          <w:color w:val="2E7D5B"/>
+          <w:sz w:val="36"/>
+          <w:szCs w:val="36"/>
+        </w:rPr>
         <w:t xml:space="preserve">11. Conclusion</w:t>
       </w:r>
     </w:p>
@@ -19231,7 +20852,7 @@
           <w:sz w:val="22"/>
           <w:szCs w:val="22"/>
         </w:rPr>
-        <w:t xml:space="preserve">Le present cahier des charges definit les bases solides pour le developpement de MY HOME CI, plateforme de mise en relation locative mobile dediee a la Cote d'Ivoire.</w:t>
+        <w:t xml:space="preserve">Le present cahier des charges definit les bases solides pour le developpement de My Home CI, plateforme de mise en relation locative mobile dediee a la Cote d'Ivoire.</w:t>
       </w:r>
     </w:p>
     <w:p>
@@ -19781,7 +21402,7 @@
                 <w:sz w:val="20"/>
                 <w:szCs w:val="20"/>
               </w:rPr>
-              <w:t xml:space="preserve">MY HOME CI</w:t>
+              <w:t xml:space="preserve">My Home CI</w:t>
             </w:r>
           </w:p>
         </w:tc>
@@ -20797,7 +22418,7 @@
         <w:sz w:val="16"/>
         <w:szCs w:val="16"/>
       </w:rPr>
-      <w:t xml:space="preserve">MY HOME CI — Cahier des Charges</w:t>
+      <w:t xml:space="preserve">My Home CI — Cahier des Charges</w:t>
     </w:r>
   </w:p>
 </w:hdr>

</xml_diff>